<commit_message>
Nueva funcion Firma digital
</commit_message>
<xml_diff>
--- a/financiera/templates_docx/PLANTILLA_SOLICITUD_DE_CREDITO.docx
+++ b/financiera/templates_docx/PLANTILLA_SOLICITUD_DE_CREDITO.docx
@@ -461,7 +461,15 @@
                 <w:w w:val="105"/>
                 <w:sz w:val="13"/>
               </w:rPr>
-              <w:t> Préstamos que tiene con el RAP:</w:t>
+              <w:br/>
+            </w:r>
+            <w:r>
+              <w:rPr>
+                <w:color w:val="1D1D1B"/>
+                <w:w w:val="105"/>
+                <w:sz w:val="13"/>
+              </w:rPr>
+              <w:t>Préstamos que tiene con el RAP:</w:t>
             </w:r>
             <w:r>
               <w:rPr>

</xml_diff>